<commit_message>
migrated from inspect.sr primary site to inspect-sr.com with redirect for inspect.sr
</commit_message>
<xml_diff>
--- a/_book/INSPECT-SR-Guidance.docx
+++ b/_book/INSPECT-SR-Guidance.docx
@@ -60,7 +60,7 @@
         </w:p>
       </w:sdtContent>
     </w:sdt>
-    <w:bookmarkStart w:id="91" w:name="introduction"/>
+    <w:bookmarkStart w:id="92" w:name="introduction"/>
     <w:p>
       <w:pPr>
         <w:pStyle w:val="Heading1"/>
@@ -80,6 +80,20 @@
         <w:t xml:space="preserve"> </w:t>
       </w:r>
       <w:hyperlink r:id="rId20">
+        <w:r>
+          <w:rPr>
+            <w:rStyle w:val="Hyperlink"/>
+          </w:rPr>
+          <w:t xml:space="preserve">https://inspect-sr.com</w:t>
+        </w:r>
+      </w:hyperlink>
+      <w:r>
+        <w:t xml:space="preserve">. The original address,</w:t>
+      </w:r>
+      <w:r>
+        <w:t xml:space="preserve"> </w:t>
+      </w:r>
+      <w:hyperlink r:id="rId21">
         <w:r>
           <w:rPr>
             <w:rStyle w:val="Hyperlink"/>
@@ -88,9 +102,47 @@
         </w:r>
       </w:hyperlink>
       <w:r>
-        <w:t xml:space="preserve">. A pdf of the website is also hosted on OSF (</w:t>
-      </w:r>
-      <w:hyperlink r:id="rId21">
+        <w:t xml:space="preserve">, also works and redirects here — both are maintained permanently, but</w:t>
+      </w:r>
+      <w:r>
+        <w:t xml:space="preserve"> </w:t>
+      </w:r>
+      <w:r>
+        <w:rPr>
+          <w:rStyle w:val="VerbatimChar"/>
+        </w:rPr>
+        <w:t xml:space="preserve">inspect-sr.com</w:t>
+      </w:r>
+      <w:r>
+        <w:t xml:space="preserve"> </w:t>
+      </w:r>
+      <w:r>
+        <w:t xml:space="preserve">is preferred, as some institutional networks block the</w:t>
+      </w:r>
+      <w:r>
+        <w:t xml:space="preserve"> </w:t>
+      </w:r>
+      <w:r>
+        <w:rPr>
+          <w:rStyle w:val="VerbatimChar"/>
+        </w:rPr>
+        <w:t xml:space="preserve">.sr</w:t>
+      </w:r>
+      <w:r>
+        <w:t xml:space="preserve"> </w:t>
+      </w:r>
+      <w:r>
+        <w:t xml:space="preserve">domain.</w:t>
+      </w:r>
+    </w:p>
+    <w:p>
+      <w:pPr>
+        <w:pStyle w:val="BodyText"/>
+      </w:pPr>
+      <w:r>
+        <w:t xml:space="preserve">A pdf of the website is also hosted on OSF (</w:t>
+      </w:r>
+      <w:hyperlink r:id="rId22">
         <w:r>
           <w:rPr>
             <w:rStyle w:val="Hyperlink"/>
@@ -109,7 +161,7 @@
       <w:r>
         <w:t xml:space="preserve">INSPECT-SR (</w:t>
       </w:r>
-      <w:hyperlink r:id="rId22">
+      <w:hyperlink r:id="rId23">
         <w:r>
           <w:rPr>
             <w:rStyle w:val="Hyperlink"/>
@@ -137,7 +189,7 @@
         <w:t xml:space="preserve">INSPECT-SR contains 21 checks across four domains to help the reviewer make a judgement about whether a study’s data and findings can be trusted sufficiently to include it in a research synthesis.</w:t>
       </w:r>
     </w:p>
-    <w:bookmarkStart w:id="24" w:name="citation"/>
+    <w:bookmarkStart w:id="25" w:name="citation"/>
     <w:p>
       <w:pPr>
         <w:pStyle w:val="Heading2"/>
@@ -177,7 +229,7 @@
       <w:r>
         <w:t xml:space="preserve"> </w:t>
       </w:r>
-      <w:hyperlink r:id="rId22">
+      <w:hyperlink r:id="rId23">
         <w:r>
           <w:rPr>
             <w:rStyle w:val="Hyperlink"/>
@@ -212,7 +264,7 @@
       <w:r>
         <w:t xml:space="preserve"> </w:t>
       </w:r>
-      <w:hyperlink r:id="rId23">
+      <w:hyperlink r:id="rId24">
         <w:r>
           <w:rPr>
             <w:rStyle w:val="Hyperlink"/>
@@ -221,8 +273,8 @@
         </w:r>
       </w:hyperlink>
     </w:p>
-    <w:bookmarkEnd w:id="24"/>
-    <w:bookmarkStart w:id="72" w:name="contributors"/>
+    <w:bookmarkEnd w:id="25"/>
+    <w:bookmarkStart w:id="73" w:name="contributors"/>
     <w:p>
       <w:pPr>
         <w:pStyle w:val="Heading2"/>
@@ -241,7 +293,7 @@
       <w:r>
         <w:t xml:space="preserve"> </w:t>
       </w:r>
-      <w:hyperlink r:id="rId25">
+      <w:hyperlink r:id="rId26">
         <w:r>
           <w:rPr>
             <w:rStyle w:val="Hyperlink"/>
@@ -328,7 +380,7 @@
             <w:r>
               <w:t xml:space="preserve"> </w:t>
             </w:r>
-            <w:hyperlink r:id="rId26"/>
+            <w:hyperlink r:id="rId27"/>
           </w:p>
         </w:tc>
         <w:tc>
@@ -370,7 +422,7 @@
             <w:r>
               <w:t xml:space="preserve"> </w:t>
             </w:r>
-            <w:hyperlink r:id="rId27"/>
+            <w:hyperlink r:id="rId28"/>
           </w:p>
         </w:tc>
         <w:tc>
@@ -412,7 +464,7 @@
             <w:r>
               <w:t xml:space="preserve"> </w:t>
             </w:r>
-            <w:hyperlink r:id="rId28"/>
+            <w:hyperlink r:id="rId29"/>
           </w:p>
         </w:tc>
         <w:tc>
@@ -530,7 +582,7 @@
             <w:r>
               <w:t xml:space="preserve"> </w:t>
             </w:r>
-            <w:hyperlink r:id="rId29"/>
+            <w:hyperlink r:id="rId30"/>
           </w:p>
         </w:tc>
         <w:tc>
@@ -572,7 +624,7 @@
             <w:r>
               <w:t xml:space="preserve"> </w:t>
             </w:r>
-            <w:hyperlink r:id="rId30"/>
+            <w:hyperlink r:id="rId31"/>
           </w:p>
         </w:tc>
         <w:tc>
@@ -614,7 +666,7 @@
             <w:r>
               <w:t xml:space="preserve"> </w:t>
             </w:r>
-            <w:hyperlink r:id="rId31"/>
+            <w:hyperlink r:id="rId32"/>
           </w:p>
         </w:tc>
         <w:tc>
@@ -656,7 +708,7 @@
             <w:r>
               <w:t xml:space="preserve"> </w:t>
             </w:r>
-            <w:hyperlink r:id="rId32"/>
+            <w:hyperlink r:id="rId33"/>
           </w:p>
         </w:tc>
         <w:tc>
@@ -698,7 +750,7 @@
             <w:r>
               <w:t xml:space="preserve"> </w:t>
             </w:r>
-            <w:hyperlink r:id="rId33"/>
+            <w:hyperlink r:id="rId34"/>
           </w:p>
         </w:tc>
         <w:tc>
@@ -740,7 +792,7 @@
             <w:r>
               <w:t xml:space="preserve"> </w:t>
             </w:r>
-            <w:hyperlink r:id="rId34"/>
+            <w:hyperlink r:id="rId35"/>
           </w:p>
         </w:tc>
         <w:tc>
@@ -782,7 +834,7 @@
             <w:r>
               <w:t xml:space="preserve"> </w:t>
             </w:r>
-            <w:hyperlink r:id="rId35"/>
+            <w:hyperlink r:id="rId36"/>
           </w:p>
         </w:tc>
         <w:tc>
@@ -824,7 +876,7 @@
             <w:r>
               <w:t xml:space="preserve"> </w:t>
             </w:r>
-            <w:hyperlink r:id="rId36"/>
+            <w:hyperlink r:id="rId37"/>
           </w:p>
         </w:tc>
         <w:tc>
@@ -866,7 +918,7 @@
             <w:r>
               <w:t xml:space="preserve"> </w:t>
             </w:r>
-            <w:hyperlink r:id="rId37"/>
+            <w:hyperlink r:id="rId38"/>
           </w:p>
         </w:tc>
         <w:tc>
@@ -908,7 +960,7 @@
             <w:r>
               <w:t xml:space="preserve"> </w:t>
             </w:r>
-            <w:hyperlink r:id="rId38"/>
+            <w:hyperlink r:id="rId39"/>
           </w:p>
         </w:tc>
         <w:tc>
@@ -950,7 +1002,7 @@
             <w:r>
               <w:t xml:space="preserve"> </w:t>
             </w:r>
-            <w:hyperlink r:id="rId39"/>
+            <w:hyperlink r:id="rId40"/>
           </w:p>
         </w:tc>
         <w:tc>
@@ -992,7 +1044,7 @@
             <w:r>
               <w:t xml:space="preserve"> </w:t>
             </w:r>
-            <w:hyperlink r:id="rId40"/>
+            <w:hyperlink r:id="rId41"/>
           </w:p>
         </w:tc>
         <w:tc>
@@ -1034,7 +1086,7 @@
             <w:r>
               <w:t xml:space="preserve"> </w:t>
             </w:r>
-            <w:hyperlink r:id="rId41"/>
+            <w:hyperlink r:id="rId42"/>
           </w:p>
         </w:tc>
         <w:tc>
@@ -1114,7 +1166,7 @@
             <w:r>
               <w:t xml:space="preserve"> </w:t>
             </w:r>
-            <w:hyperlink r:id="rId42"/>
+            <w:hyperlink r:id="rId43"/>
           </w:p>
         </w:tc>
         <w:tc>
@@ -1156,7 +1208,7 @@
             <w:r>
               <w:t xml:space="preserve"> </w:t>
             </w:r>
-            <w:hyperlink r:id="rId43"/>
+            <w:hyperlink r:id="rId44"/>
           </w:p>
         </w:tc>
         <w:tc>
@@ -1236,7 +1288,7 @@
             <w:r>
               <w:t xml:space="preserve"> </w:t>
             </w:r>
-            <w:hyperlink r:id="rId44"/>
+            <w:hyperlink r:id="rId45"/>
           </w:p>
         </w:tc>
         <w:tc>
@@ -1278,7 +1330,7 @@
             <w:r>
               <w:t xml:space="preserve"> </w:t>
             </w:r>
-            <w:hyperlink r:id="rId45"/>
+            <w:hyperlink r:id="rId46"/>
           </w:p>
         </w:tc>
         <w:tc>
@@ -1320,7 +1372,7 @@
             <w:r>
               <w:t xml:space="preserve"> </w:t>
             </w:r>
-            <w:hyperlink r:id="rId46"/>
+            <w:hyperlink r:id="rId47"/>
           </w:p>
         </w:tc>
         <w:tc>
@@ -1362,7 +1414,7 @@
             <w:r>
               <w:t xml:space="preserve"> </w:t>
             </w:r>
-            <w:hyperlink r:id="rId47"/>
+            <w:hyperlink r:id="rId48"/>
           </w:p>
         </w:tc>
         <w:tc>
@@ -1404,7 +1456,7 @@
             <w:r>
               <w:t xml:space="preserve"> </w:t>
             </w:r>
-            <w:hyperlink r:id="rId48"/>
+            <w:hyperlink r:id="rId49"/>
           </w:p>
         </w:tc>
         <w:tc>
@@ -1484,7 +1536,7 @@
             <w:r>
               <w:t xml:space="preserve"> </w:t>
             </w:r>
-            <w:hyperlink r:id="rId49"/>
+            <w:hyperlink r:id="rId50"/>
           </w:p>
         </w:tc>
         <w:tc>
@@ -1526,7 +1578,7 @@
             <w:r>
               <w:t xml:space="preserve"> </w:t>
             </w:r>
-            <w:hyperlink r:id="rId50"/>
+            <w:hyperlink r:id="rId51"/>
           </w:p>
         </w:tc>
         <w:tc>
@@ -1568,7 +1620,7 @@
             <w:r>
               <w:t xml:space="preserve"> </w:t>
             </w:r>
-            <w:hyperlink r:id="rId51"/>
+            <w:hyperlink r:id="rId52"/>
           </w:p>
         </w:tc>
         <w:tc>
@@ -1610,7 +1662,7 @@
             <w:r>
               <w:t xml:space="preserve"> </w:t>
             </w:r>
-            <w:hyperlink r:id="rId52"/>
+            <w:hyperlink r:id="rId53"/>
           </w:p>
         </w:tc>
         <w:tc>
@@ -1652,7 +1704,7 @@
             <w:r>
               <w:t xml:space="preserve"> </w:t>
             </w:r>
-            <w:hyperlink r:id="rId53"/>
+            <w:hyperlink r:id="rId54"/>
           </w:p>
         </w:tc>
         <w:tc>
@@ -1732,7 +1784,7 @@
             <w:r>
               <w:t xml:space="preserve"> </w:t>
             </w:r>
-            <w:hyperlink r:id="rId54"/>
+            <w:hyperlink r:id="rId55"/>
           </w:p>
         </w:tc>
         <w:tc>
@@ -1774,7 +1826,7 @@
             <w:r>
               <w:t xml:space="preserve"> </w:t>
             </w:r>
-            <w:hyperlink r:id="rId55"/>
+            <w:hyperlink r:id="rId56"/>
           </w:p>
         </w:tc>
         <w:tc>
@@ -1816,7 +1868,7 @@
             <w:r>
               <w:t xml:space="preserve"> </w:t>
             </w:r>
-            <w:hyperlink r:id="rId56"/>
+            <w:hyperlink r:id="rId57"/>
           </w:p>
         </w:tc>
         <w:tc>
@@ -1858,7 +1910,7 @@
             <w:r>
               <w:t xml:space="preserve"> </w:t>
             </w:r>
-            <w:hyperlink r:id="rId57"/>
+            <w:hyperlink r:id="rId58"/>
           </w:p>
         </w:tc>
         <w:tc>
@@ -1900,7 +1952,7 @@
             <w:r>
               <w:t xml:space="preserve"> </w:t>
             </w:r>
-            <w:hyperlink r:id="rId58"/>
+            <w:hyperlink r:id="rId59"/>
           </w:p>
         </w:tc>
         <w:tc>
@@ -1942,7 +1994,7 @@
             <w:r>
               <w:t xml:space="preserve"> </w:t>
             </w:r>
-            <w:hyperlink r:id="rId59"/>
+            <w:hyperlink r:id="rId60"/>
           </w:p>
         </w:tc>
         <w:tc>
@@ -2060,7 +2112,7 @@
             <w:r>
               <w:t xml:space="preserve"> </w:t>
             </w:r>
-            <w:hyperlink r:id="rId60"/>
+            <w:hyperlink r:id="rId61"/>
           </w:p>
         </w:tc>
         <w:tc>
@@ -2102,7 +2154,7 @@
             <w:r>
               <w:t xml:space="preserve"> </w:t>
             </w:r>
-            <w:hyperlink r:id="rId61"/>
+            <w:hyperlink r:id="rId62"/>
           </w:p>
         </w:tc>
         <w:tc>
@@ -2144,7 +2196,7 @@
             <w:r>
               <w:t xml:space="preserve"> </w:t>
             </w:r>
-            <w:hyperlink r:id="rId62"/>
+            <w:hyperlink r:id="rId63"/>
           </w:p>
         </w:tc>
         <w:tc>
@@ -2186,7 +2238,7 @@
             <w:r>
               <w:t xml:space="preserve"> </w:t>
             </w:r>
-            <w:hyperlink r:id="rId63"/>
+            <w:hyperlink r:id="rId64"/>
           </w:p>
         </w:tc>
         <w:tc>
@@ -2228,7 +2280,7 @@
             <w:r>
               <w:t xml:space="preserve"> </w:t>
             </w:r>
-            <w:hyperlink r:id="rId64"/>
+            <w:hyperlink r:id="rId65"/>
           </w:p>
         </w:tc>
         <w:tc>
@@ -2270,7 +2322,7 @@
             <w:r>
               <w:t xml:space="preserve"> </w:t>
             </w:r>
-            <w:hyperlink r:id="rId65"/>
+            <w:hyperlink r:id="rId66"/>
           </w:p>
         </w:tc>
         <w:tc>
@@ -2312,7 +2364,7 @@
             <w:r>
               <w:t xml:space="preserve"> </w:t>
             </w:r>
-            <w:hyperlink r:id="rId66"/>
+            <w:hyperlink r:id="rId67"/>
           </w:p>
         </w:tc>
         <w:tc>
@@ -2354,7 +2406,7 @@
             <w:r>
               <w:t xml:space="preserve"> </w:t>
             </w:r>
-            <w:hyperlink r:id="rId67"/>
+            <w:hyperlink r:id="rId68"/>
           </w:p>
         </w:tc>
         <w:tc>
@@ -2396,7 +2448,7 @@
             <w:r>
               <w:t xml:space="preserve"> </w:t>
             </w:r>
-            <w:hyperlink r:id="rId68"/>
+            <w:hyperlink r:id="rId69"/>
           </w:p>
         </w:tc>
         <w:tc>
@@ -2438,7 +2490,7 @@
             <w:r>
               <w:t xml:space="preserve"> </w:t>
             </w:r>
-            <w:hyperlink r:id="rId69"/>
+            <w:hyperlink r:id="rId70"/>
           </w:p>
         </w:tc>
         <w:tc>
@@ -2480,7 +2532,7 @@
             <w:r>
               <w:t xml:space="preserve"> </w:t>
             </w:r>
-            <w:hyperlink r:id="rId70"/>
+            <w:hyperlink r:id="rId71"/>
           </w:p>
         </w:tc>
         <w:tc>
@@ -2522,7 +2574,7 @@
             <w:r>
               <w:t xml:space="preserve"> </w:t>
             </w:r>
-            <w:hyperlink r:id="rId71"/>
+            <w:hyperlink r:id="rId72"/>
           </w:p>
         </w:tc>
         <w:tc>
@@ -2551,8 +2603,8 @@
         </w:tc>
       </w:tr>
     </w:tbl>
-    <w:bookmarkEnd w:id="72"/>
-    <w:bookmarkStart w:id="73" w:name="motivation-for-inspect-sr"/>
+    <w:bookmarkEnd w:id="73"/>
+    <w:bookmarkStart w:id="74" w:name="motivation-for-inspect-sr"/>
     <w:p>
       <w:pPr>
         <w:pStyle w:val="Heading2"/>
@@ -2586,8 +2638,8 @@
         <w:t xml:space="preserve">This prompts the question of how we can identify problematic studies. The INSPECT-SR (INveStigating ProblEmatic Clinical Trials in Systematic Reviews) tool has been developed for this purpose, using empirical evidence and consensus methodology. The development process has been described in a protocol paper and in associated results papers. The tool can be used to assess the trustworthiness of RCTs.</w:t>
       </w:r>
     </w:p>
-    <w:bookmarkEnd w:id="73"/>
-    <w:bookmarkStart w:id="75" w:name="version-and-feedback"/>
+    <w:bookmarkEnd w:id="74"/>
+    <w:bookmarkStart w:id="76" w:name="version-and-feedback"/>
     <w:p>
       <w:pPr>
         <w:pStyle w:val="Heading2"/>
@@ -2606,7 +2658,7 @@
       <w:r>
         <w:t xml:space="preserve"> </w:t>
       </w:r>
-      <w:hyperlink r:id="rId74">
+      <w:hyperlink r:id="rId75">
         <w:r>
           <w:rPr>
             <w:rStyle w:val="Hyperlink"/>
@@ -2618,8 +2670,8 @@
         <w:t xml:space="preserve">. This feedback will be monitored by the INSPECT-SR Study Management Group, and feedback will be used to update the guidance document. However, reviewers should not expect responses to questions posted on the feedback survey.</w:t>
       </w:r>
     </w:p>
-    <w:bookmarkEnd w:id="75"/>
-    <w:bookmarkStart w:id="76" w:name="overview-of-the-inspect-sr-tool"/>
+    <w:bookmarkEnd w:id="76"/>
+    <w:bookmarkStart w:id="77" w:name="overview-of-the-inspect-sr-tool"/>
     <w:p>
       <w:pPr>
         <w:pStyle w:val="Heading2"/>
@@ -2794,8 +2846,8 @@
         <w:t xml:space="preserve">The checks in each domain assist the systematic reviewer in identifying any domain-level concerns relating to trustworthiness. The reviewer may then use the domain-level judgement to arrive at an overall judgement about the trustworthiness of a trial. We emphasise that concerns about a trial’s trustworthiness do not amount to an accusation of misconduct. INSPECT-SR is not concerned with determining whether inauthentic data have arisen due to deliberate misconduct or honest error.</w:t>
       </w:r>
     </w:p>
-    <w:bookmarkEnd w:id="76"/>
-    <w:bookmarkStart w:id="77" w:name="X9100f48009e94b370d8c0b155865ee9c9f739f4"/>
+    <w:bookmarkEnd w:id="77"/>
+    <w:bookmarkStart w:id="78" w:name="X9100f48009e94b370d8c0b155865ee9c9f739f4"/>
     <w:p>
       <w:pPr>
         <w:pStyle w:val="Heading2"/>
@@ -3011,8 +3063,8 @@
         <w:t xml:space="preserve">A trial may be reported across several publications, including conference abstracts, preprints, protocol papers, and secondary analysis papers. As for Risk of Bias assessment, it will typically be necessary to consider all of the publications describing the trial to obtain the information necessary to complete the checks. The final check in the tool explicitly asks the reviewer to consider whether there are any contradictions in information reported in different publications relating to the index trial.</w:t>
       </w:r>
     </w:p>
-    <w:bookmarkEnd w:id="77"/>
-    <w:bookmarkStart w:id="79" w:name="X59bcbc5e4a03fc867a70cb4d43418964822f3ee"/>
+    <w:bookmarkEnd w:id="78"/>
+    <w:bookmarkStart w:id="80" w:name="X59bcbc5e4a03fc867a70cb4d43418964822f3ee"/>
     <w:p>
       <w:pPr>
         <w:pStyle w:val="Heading2"/>
@@ -3144,7 +3196,7 @@
       <w:r>
         <w:t xml:space="preserve"> </w:t>
       </w:r>
-      <w:hyperlink r:id="rId78">
+      <w:hyperlink r:id="rId79">
         <w:r>
           <w:rPr>
             <w:rStyle w:val="Hyperlink"/>
@@ -3156,8 +3208,8 @@
         <w:t xml:space="preserve">.</w:t>
       </w:r>
     </w:p>
-    <w:bookmarkEnd w:id="79"/>
-    <w:bookmarkStart w:id="84" w:name="Xf8c09140d43096fd5b8e1b398e336baceed5e9e"/>
+    <w:bookmarkEnd w:id="80"/>
+    <w:bookmarkStart w:id="85" w:name="Xf8c09140d43096fd5b8e1b398e336baceed5e9e"/>
     <w:p>
       <w:pPr>
         <w:pStyle w:val="Heading2"/>
@@ -3295,18 +3347,18 @@
           <wp:inline>
             <wp:extent cx="5943600" cy="2830285"/>
             <wp:effectExtent b="0" l="0" r="0" t="0"/>
-            <wp:docPr descr="Figure 1: Structure of the INSPECT-SR tool" title="" id="81" name="Picture"/>
+            <wp:docPr descr="Figure 1: Structure of the INSPECT-SR tool" title="" id="82" name="Picture"/>
             <a:graphic>
               <a:graphicData uri="http://schemas.openxmlformats.org/drawingml/2006/picture">
                 <pic:pic>
                   <pic:nvPicPr>
-                    <pic:cNvPr descr="images/structure.png" id="82" name="Picture"/>
+                    <pic:cNvPr descr="images/structure.png" id="83" name="Picture"/>
                     <pic:cNvPicPr>
                       <a:picLocks noChangeArrowheads="1" noChangeAspect="1"/>
                     </pic:cNvPicPr>
                   </pic:nvPicPr>
                   <pic:blipFill>
-                    <a:blip r:embed="rId80"/>
+                    <a:blip r:embed="rId81"/>
                     <a:stretch>
                       <a:fillRect/>
                     </a:stretch>
@@ -3371,7 +3423,7 @@
       <w:r>
         <w:t xml:space="preserve"> </w:t>
       </w:r>
-      <w:hyperlink r:id="rId83">
+      <w:hyperlink r:id="rId84">
         <w:r>
           <w:rPr>
             <w:rStyle w:val="Hyperlink"/>
@@ -3385,7 +3437,7 @@
       <w:r>
         <w:t xml:space="preserve"> </w:t>
       </w:r>
-      <w:hyperlink r:id="rId74">
+      <w:hyperlink r:id="rId75">
         <w:r>
           <w:rPr>
             <w:rStyle w:val="Hyperlink"/>
@@ -3397,8 +3449,8 @@
         <w:t xml:space="preserve">.</w:t>
       </w:r>
     </w:p>
-    <w:bookmarkEnd w:id="84"/>
-    <w:bookmarkStart w:id="90" w:name="resources"/>
+    <w:bookmarkEnd w:id="85"/>
+    <w:bookmarkStart w:id="91" w:name="resources"/>
     <w:p>
       <w:pPr>
         <w:pStyle w:val="Heading2"/>
@@ -3415,7 +3467,7 @@
           <w:numId w:val="1001"/>
         </w:numPr>
       </w:pPr>
-      <w:hyperlink r:id="rId85">
+      <w:hyperlink r:id="rId86">
         <w:r>
           <w:rPr>
             <w:rStyle w:val="Hyperlink"/>
@@ -3438,7 +3490,7 @@
           <w:numId w:val="1001"/>
         </w:numPr>
       </w:pPr>
-      <w:hyperlink r:id="rId74">
+      <w:hyperlink r:id="rId75">
         <w:r>
           <w:rPr>
             <w:rStyle w:val="Hyperlink"/>
@@ -3461,7 +3513,7 @@
           <w:numId w:val="1001"/>
         </w:numPr>
       </w:pPr>
-      <w:hyperlink r:id="rId86">
+      <w:hyperlink r:id="rId87">
         <w:r>
           <w:rPr>
             <w:rStyle w:val="Hyperlink"/>
@@ -3484,7 +3536,7 @@
           <w:numId w:val="1001"/>
         </w:numPr>
       </w:pPr>
-      <w:hyperlink r:id="rId87">
+      <w:hyperlink r:id="rId88">
         <w:r>
           <w:rPr>
             <w:rStyle w:val="Hyperlink"/>
@@ -3507,7 +3559,7 @@
           <w:numId w:val="1001"/>
         </w:numPr>
       </w:pPr>
-      <w:hyperlink r:id="rId78">
+      <w:hyperlink r:id="rId79">
         <w:r>
           <w:rPr>
             <w:rStyle w:val="Hyperlink"/>
@@ -3530,7 +3582,7 @@
           <w:numId w:val="1001"/>
         </w:numPr>
       </w:pPr>
-      <w:hyperlink r:id="rId88">
+      <w:hyperlink r:id="rId89">
         <w:r>
           <w:rPr>
             <w:rStyle w:val="Hyperlink"/>
@@ -3553,7 +3605,7 @@
           <w:numId w:val="1001"/>
         </w:numPr>
       </w:pPr>
-      <w:hyperlink r:id="rId89">
+      <w:hyperlink r:id="rId90">
         <w:r>
           <w:rPr>
             <w:rStyle w:val="Hyperlink"/>
@@ -3568,9 +3620,9 @@
         <w:t xml:space="preserve">— A hub for forensic meta-science tool development</w:t>
       </w:r>
     </w:p>
-    <w:bookmarkEnd w:id="90"/>
     <w:bookmarkEnd w:id="91"/>
-    <w:bookmarkStart w:id="97" w:name="X1a801ee496a93cadedcfaff4a8913b82d495328"/>
+    <w:bookmarkEnd w:id="92"/>
+    <w:bookmarkStart w:id="98" w:name="X1a801ee496a93cadedcfaff4a8913b82d495328"/>
     <w:p>
       <w:pPr>
         <w:pStyle w:val="Heading1"/>
@@ -3621,7 +3673,7 @@
       <w:r>
         <w:t xml:space="preserve"> </w:t>
       </w:r>
-      <w:hyperlink r:id="rId86">
+      <w:hyperlink r:id="rId87">
         <w:r>
           <w:rPr>
             <w:rStyle w:val="Hyperlink"/>
@@ -3643,7 +3695,7 @@
       <w:r>
         <w:t xml:space="preserve"> </w:t>
       </w:r>
-      <w:hyperlink r:id="rId92">
+      <w:hyperlink r:id="rId93">
         <w:r>
           <w:rPr>
             <w:rStyle w:val="Hyperlink"/>
@@ -3702,7 +3754,7 @@
         <w:t xml:space="preserve">will typically be warranted, regardless of the reason for the retraction. An exception would be where a study has been retracted and subsequently replaced by a new version (e.g. to correct an error). The replacement can then be assessed using INSPECT-SR.</w:t>
       </w:r>
     </w:p>
-    <w:bookmarkStart w:id="96" w:name="example"/>
+    <w:bookmarkStart w:id="97" w:name="example"/>
     <w:p>
       <w:pPr>
         <w:pStyle w:val="Heading2"/>
@@ -3752,18 +3804,18 @@
                 <wp:inline>
                   <wp:extent cx="152400" cy="152400"/>
                   <wp:effectExtent b="0" l="0" r="0" t="0"/>
-                  <wp:docPr descr="" title="" id="94" name="Picture"/>
+                  <wp:docPr descr="" title="" id="95" name="Picture"/>
                   <a:graphic>
                     <a:graphicData uri="http://schemas.openxmlformats.org/drawingml/2006/picture">
                       <pic:pic>
                         <pic:nvPicPr>
-                          <pic:cNvPr descr="/Applications/quarto/share/formats/docx/note.png" id="95" name="Picture"/>
+                          <pic:cNvPr descr="/Applications/quarto/share/formats/docx/note.png" id="96" name="Picture"/>
                           <pic:cNvPicPr>
                             <a:picLocks noChangeArrowheads="1" noChangeAspect="1"/>
                           </pic:cNvPicPr>
                         </pic:nvPicPr>
                         <pic:blipFill>
-                          <a:blip r:embed="rId93"/>
+                          <a:blip r:embed="rId94"/>
                           <a:stretch>
                             <a:fillRect/>
                           </a:stretch>
@@ -3872,9 +3924,9 @@
         </w:tc>
       </w:tr>
     </w:tbl>
-    <w:bookmarkEnd w:id="96"/>
     <w:bookmarkEnd w:id="97"/>
-    <w:bookmarkStart w:id="105" w:name="Xcbac9ff56f68b1fea35f8226a21256e8a88cfd0"/>
+    <w:bookmarkEnd w:id="98"/>
+    <w:bookmarkStart w:id="106" w:name="Xcbac9ff56f68b1fea35f8226a21256e8a88cfd0"/>
     <w:p>
       <w:pPr>
         <w:pStyle w:val="Heading1"/>
@@ -3923,7 +3975,7 @@
       <w:r>
         <w:t xml:space="preserve"> </w:t>
       </w:r>
-      <w:hyperlink r:id="rId86">
+      <w:hyperlink r:id="rId87">
         <w:r>
           <w:rPr>
             <w:rStyle w:val="Hyperlink"/>
@@ -3945,7 +3997,7 @@
       <w:r>
         <w:t xml:space="preserve"> </w:t>
       </w:r>
-      <w:hyperlink r:id="rId98">
+      <w:hyperlink r:id="rId99">
         <w:r>
           <w:rPr>
             <w:rStyle w:val="Hyperlink"/>
@@ -3967,7 +4019,7 @@
       <w:r>
         <w:t xml:space="preserve"> </w:t>
       </w:r>
-      <w:hyperlink r:id="rId92">
+      <w:hyperlink r:id="rId93">
         <w:r>
           <w:rPr>
             <w:rStyle w:val="Hyperlink"/>
@@ -3990,7 +4042,7 @@
         <w:t xml:space="preserve">The answer to this check should contribute to a domain-level judgement.</w:t>
       </w:r>
     </w:p>
-    <w:bookmarkStart w:id="104" w:name="examples"/>
+    <w:bookmarkStart w:id="105" w:name="examples"/>
     <w:p>
       <w:pPr>
         <w:pStyle w:val="Heading2"/>
@@ -4040,18 +4092,18 @@
                 <wp:inline>
                   <wp:extent cx="152400" cy="152400"/>
                   <wp:effectExtent b="0" l="0" r="0" t="0"/>
-                  <wp:docPr descr="" title="" id="99" name="Picture"/>
+                  <wp:docPr descr="" title="" id="100" name="Picture"/>
                   <a:graphic>
                     <a:graphicData uri="http://schemas.openxmlformats.org/drawingml/2006/picture">
                       <pic:pic>
                         <pic:nvPicPr>
-                          <pic:cNvPr descr="/Applications/quarto/share/formats/docx/note.png" id="100" name="Picture"/>
+                          <pic:cNvPr descr="/Applications/quarto/share/formats/docx/note.png" id="101" name="Picture"/>
                           <pic:cNvPicPr>
                             <a:picLocks noChangeArrowheads="1" noChangeAspect="1"/>
                           </pic:cNvPicPr>
                         </pic:nvPicPr>
                         <pic:blipFill>
-                          <a:blip r:embed="rId93"/>
+                          <a:blip r:embed="rId94"/>
                           <a:stretch>
                             <a:fillRect/>
                           </a:stretch>
@@ -4113,7 +4165,7 @@
             <w:r>
               <w:t xml:space="preserve"> </w:t>
             </w:r>
-            <w:hyperlink r:id="rId101">
+            <w:hyperlink r:id="rId102">
               <w:r>
                 <w:rPr>
                   <w:rStyle w:val="Hyperlink"/>
@@ -4214,18 +4266,18 @@
                 <wp:inline>
                   <wp:extent cx="152400" cy="152400"/>
                   <wp:effectExtent b="0" l="0" r="0" t="0"/>
-                  <wp:docPr descr="" title="" id="102" name="Picture"/>
+                  <wp:docPr descr="" title="" id="103" name="Picture"/>
                   <a:graphic>
                     <a:graphicData uri="http://schemas.openxmlformats.org/drawingml/2006/picture">
                       <pic:pic>
                         <pic:nvPicPr>
-                          <pic:cNvPr descr="/Applications/quarto/share/formats/docx/note.png" id="103" name="Picture"/>
+                          <pic:cNvPr descr="/Applications/quarto/share/formats/docx/note.png" id="104" name="Picture"/>
                           <pic:cNvPicPr>
                             <a:picLocks noChangeArrowheads="1" noChangeAspect="1"/>
                           </pic:cNvPicPr>
                         </pic:nvPicPr>
                         <pic:blipFill>
-                          <a:blip r:embed="rId93"/>
+                          <a:blip r:embed="rId94"/>
                           <a:stretch>
                             <a:fillRect/>
                           </a:stretch>
@@ -4301,9 +4353,9 @@
         </w:tc>
       </w:tr>
     </w:tbl>
-    <w:bookmarkEnd w:id="104"/>
     <w:bookmarkEnd w:id="105"/>
-    <w:bookmarkStart w:id="111" w:name="Xf785ab274a85145118db61f0095e73700b942a7"/>
+    <w:bookmarkEnd w:id="106"/>
+    <w:bookmarkStart w:id="112" w:name="Xf785ab274a85145118db61f0095e73700b942a7"/>
     <w:p>
       <w:pPr>
         <w:pStyle w:val="Heading1"/>
@@ -4322,7 +4374,7 @@
       <w:r>
         <w:t xml:space="preserve"> </w:t>
       </w:r>
-      <w:hyperlink r:id="rId86">
+      <w:hyperlink r:id="rId87">
         <w:r>
           <w:rPr>
             <w:rStyle w:val="Hyperlink"/>
@@ -4382,7 +4434,7 @@
         <w:t xml:space="preserve">The answer to this check should contribute to a domain-level judgement.</w:t>
       </w:r>
     </w:p>
-    <w:bookmarkStart w:id="110" w:name="examples-1"/>
+    <w:bookmarkStart w:id="111" w:name="examples-1"/>
     <w:p>
       <w:pPr>
         <w:pStyle w:val="Heading2"/>
@@ -4432,18 +4484,18 @@
                 <wp:inline>
                   <wp:extent cx="152400" cy="152400"/>
                   <wp:effectExtent b="0" l="0" r="0" t="0"/>
-                  <wp:docPr descr="" title="" id="106" name="Picture"/>
+                  <wp:docPr descr="" title="" id="107" name="Picture"/>
                   <a:graphic>
                     <a:graphicData uri="http://schemas.openxmlformats.org/drawingml/2006/picture">
                       <pic:pic>
                         <pic:nvPicPr>
-                          <pic:cNvPr descr="/Applications/quarto/share/formats/docx/note.png" id="107" name="Picture"/>
+                          <pic:cNvPr descr="/Applications/quarto/share/formats/docx/note.png" id="108" name="Picture"/>
                           <pic:cNvPicPr>
                             <a:picLocks noChangeArrowheads="1" noChangeAspect="1"/>
                           </pic:cNvPicPr>
                         </pic:nvPicPr>
                         <pic:blipFill>
-                          <a:blip r:embed="rId93"/>
+                          <a:blip r:embed="rId94"/>
                           <a:stretch>
                             <a:fillRect/>
                           </a:stretch>
@@ -4505,7 +4557,7 @@
             <w:r>
               <w:t xml:space="preserve"> </w:t>
             </w:r>
-            <w:hyperlink r:id="rId86">
+            <w:hyperlink r:id="rId87">
               <w:r>
                 <w:rPr>
                   <w:rStyle w:val="Hyperlink"/>
@@ -4582,18 +4634,18 @@
                 <wp:inline>
                   <wp:extent cx="152400" cy="152400"/>
                   <wp:effectExtent b="0" l="0" r="0" t="0"/>
-                  <wp:docPr descr="" title="" id="108" name="Picture"/>
+                  <wp:docPr descr="" title="" id="109" name="Picture"/>
                   <a:graphic>
                     <a:graphicData uri="http://schemas.openxmlformats.org/drawingml/2006/picture">
                       <pic:pic>
                         <pic:nvPicPr>
-                          <pic:cNvPr descr="/Applications/quarto/share/formats/docx/note.png" id="109" name="Picture"/>
+                          <pic:cNvPr descr="/Applications/quarto/share/formats/docx/note.png" id="110" name="Picture"/>
                           <pic:cNvPicPr>
                             <a:picLocks noChangeArrowheads="1" noChangeAspect="1"/>
                           </pic:cNvPicPr>
                         </pic:nvPicPr>
                         <pic:blipFill>
-                          <a:blip r:embed="rId93"/>
+                          <a:blip r:embed="rId94"/>
                           <a:stretch>
                             <a:fillRect/>
                           </a:stretch>
@@ -4655,7 +4707,7 @@
             <w:r>
               <w:t xml:space="preserve"> </w:t>
             </w:r>
-            <w:hyperlink r:id="rId86">
+            <w:hyperlink r:id="rId87">
               <w:r>
                 <w:rPr>
                   <w:rStyle w:val="Hyperlink"/>
@@ -4683,9 +4735,9 @@
         </w:tc>
       </w:tr>
     </w:tbl>
-    <w:bookmarkEnd w:id="110"/>
     <w:bookmarkEnd w:id="111"/>
-    <w:bookmarkStart w:id="115" w:name="X00dde75348e0a67f2c13cbc5d6f644fa1f13e11"/>
+    <w:bookmarkEnd w:id="112"/>
+    <w:bookmarkStart w:id="116" w:name="X00dde75348e0a67f2c13cbc5d6f644fa1f13e11"/>
     <w:p>
       <w:pPr>
         <w:pStyle w:val="Heading1"/>
@@ -4751,7 +4803,7 @@
         <w:t xml:space="preserve">The answer to this check should contribute to a domain-level judgement.</w:t>
       </w:r>
     </w:p>
-    <w:bookmarkStart w:id="114" w:name="example-1"/>
+    <w:bookmarkStart w:id="115" w:name="example-1"/>
     <w:p>
       <w:pPr>
         <w:pStyle w:val="Heading2"/>
@@ -4801,18 +4853,18 @@
                 <wp:inline>
                   <wp:extent cx="152400" cy="152400"/>
                   <wp:effectExtent b="0" l="0" r="0" t="0"/>
-                  <wp:docPr descr="" title="" id="112" name="Picture"/>
+                  <wp:docPr descr="" title="" id="113" name="Picture"/>
                   <a:graphic>
                     <a:graphicData uri="http://schemas.openxmlformats.org/drawingml/2006/picture">
                       <pic:pic>
                         <pic:nvPicPr>
-                          <pic:cNvPr descr="/Applications/quarto/share/formats/docx/note.png" id="113" name="Picture"/>
+                          <pic:cNvPr descr="/Applications/quarto/share/formats/docx/note.png" id="114" name="Picture"/>
                           <pic:cNvPicPr>
                             <a:picLocks noChangeArrowheads="1" noChangeAspect="1"/>
                           </pic:cNvPicPr>
                         </pic:nvPicPr>
                         <pic:blipFill>
-                          <a:blip r:embed="rId93"/>
+                          <a:blip r:embed="rId94"/>
                           <a:stretch>
                             <a:fillRect/>
                           </a:stretch>
@@ -4897,9 +4949,9 @@
         </w:tc>
       </w:tr>
     </w:tbl>
-    <w:bookmarkEnd w:id="114"/>
     <w:bookmarkEnd w:id="115"/>
-    <w:bookmarkStart w:id="119" w:name="X21effb64d5040d96cfa8d3f206e4bd2c5f33b7d"/>
+    <w:bookmarkEnd w:id="116"/>
+    <w:bookmarkStart w:id="120" w:name="X21effb64d5040d96cfa8d3f206e4bd2c5f33b7d"/>
     <w:p>
       <w:pPr>
         <w:pStyle w:val="Heading1"/>
@@ -4970,7 +5022,7 @@
         <w:t xml:space="preserve">The answer to this check should contribute to a domain-level judgement.</w:t>
       </w:r>
     </w:p>
-    <w:bookmarkStart w:id="118" w:name="example-2"/>
+    <w:bookmarkStart w:id="119" w:name="example-2"/>
     <w:p>
       <w:pPr>
         <w:pStyle w:val="Heading2"/>
@@ -5020,18 +5072,18 @@
                 <wp:inline>
                   <wp:extent cx="152400" cy="152400"/>
                   <wp:effectExtent b="0" l="0" r="0" t="0"/>
-                  <wp:docPr descr="" title="" id="116" name="Picture"/>
+                  <wp:docPr descr="" title="" id="117" name="Picture"/>
                   <a:graphic>
                     <a:graphicData uri="http://schemas.openxmlformats.org/drawingml/2006/picture">
                       <pic:pic>
                         <pic:nvPicPr>
-                          <pic:cNvPr descr="/Applications/quarto/share/formats/docx/note.png" id="117" name="Picture"/>
+                          <pic:cNvPr descr="/Applications/quarto/share/formats/docx/note.png" id="118" name="Picture"/>
                           <pic:cNvPicPr>
                             <a:picLocks noChangeArrowheads="1" noChangeAspect="1"/>
                           </pic:cNvPicPr>
                         </pic:nvPicPr>
                         <pic:blipFill>
-                          <a:blip r:embed="rId93"/>
+                          <a:blip r:embed="rId94"/>
                           <a:stretch>
                             <a:fillRect/>
                           </a:stretch>
@@ -5107,9 +5159,9 @@
         </w:tc>
       </w:tr>
     </w:tbl>
-    <w:bookmarkEnd w:id="118"/>
     <w:bookmarkEnd w:id="119"/>
-    <w:bookmarkStart w:id="123" w:name="Xb5f4946875e08b48d0ea3201a86db25f160f794"/>
+    <w:bookmarkEnd w:id="120"/>
+    <w:bookmarkStart w:id="124" w:name="Xb5f4946875e08b48d0ea3201a86db25f160f794"/>
     <w:p>
       <w:pPr>
         <w:pStyle w:val="Heading1"/>
@@ -5194,7 +5246,7 @@
         <w:t xml:space="preserve">The answer to this check should contribute to a domain-level judgement.</w:t>
       </w:r>
     </w:p>
-    <w:bookmarkStart w:id="122" w:name="example-3"/>
+    <w:bookmarkStart w:id="123" w:name="example-3"/>
     <w:p>
       <w:pPr>
         <w:pStyle w:val="Heading2"/>
@@ -5244,18 +5296,18 @@
                 <wp:inline>
                   <wp:extent cx="152400" cy="152400"/>
                   <wp:effectExtent b="0" l="0" r="0" t="0"/>
-                  <wp:docPr descr="" title="" id="120" name="Picture"/>
+                  <wp:docPr descr="" title="" id="121" name="Picture"/>
                   <a:graphic>
                     <a:graphicData uri="http://schemas.openxmlformats.org/drawingml/2006/picture">
                       <pic:pic>
                         <pic:nvPicPr>
-                          <pic:cNvPr descr="/Applications/quarto/share/formats/docx/note.png" id="121" name="Picture"/>
+                          <pic:cNvPr descr="/Applications/quarto/share/formats/docx/note.png" id="122" name="Picture"/>
                           <pic:cNvPicPr>
                             <a:picLocks noChangeArrowheads="1" noChangeAspect="1"/>
                           </pic:cNvPicPr>
                         </pic:nvPicPr>
                         <pic:blipFill>
-                          <a:blip r:embed="rId93"/>
+                          <a:blip r:embed="rId94"/>
                           <a:stretch>
                             <a:fillRect/>
                           </a:stretch>
@@ -5331,9 +5383,9 @@
         </w:tc>
       </w:tr>
     </w:tbl>
-    <w:bookmarkEnd w:id="122"/>
     <w:bookmarkEnd w:id="123"/>
-    <w:bookmarkStart w:id="129" w:name="X15ad5a5755ad409d93f671ddbb71949aa6201d5"/>
+    <w:bookmarkEnd w:id="124"/>
+    <w:bookmarkStart w:id="130" w:name="X15ad5a5755ad409d93f671ddbb71949aa6201d5"/>
     <w:p>
       <w:pPr>
         <w:pStyle w:val="Heading1"/>
@@ -5382,7 +5434,7 @@
         <w:t xml:space="preserve">The answer to this check should contribute to a domain-level judgement.</w:t>
       </w:r>
     </w:p>
-    <w:bookmarkStart w:id="128" w:name="examples-2"/>
+    <w:bookmarkStart w:id="129" w:name="examples-2"/>
     <w:p>
       <w:pPr>
         <w:pStyle w:val="Heading2"/>
@@ -5432,18 +5484,18 @@
                 <wp:inline>
                   <wp:extent cx="152400" cy="152400"/>
                   <wp:effectExtent b="0" l="0" r="0" t="0"/>
-                  <wp:docPr descr="" title="" id="124" name="Picture"/>
+                  <wp:docPr descr="" title="" id="125" name="Picture"/>
                   <a:graphic>
                     <a:graphicData uri="http://schemas.openxmlformats.org/drawingml/2006/picture">
                       <pic:pic>
                         <pic:nvPicPr>
-                          <pic:cNvPr descr="/Applications/quarto/share/formats/docx/note.png" id="125" name="Picture"/>
+                          <pic:cNvPr descr="/Applications/quarto/share/formats/docx/note.png" id="126" name="Picture"/>
                           <pic:cNvPicPr>
                             <a:picLocks noChangeArrowheads="1" noChangeAspect="1"/>
                           </pic:cNvPicPr>
                         </pic:nvPicPr>
                         <pic:blipFill>
-                          <a:blip r:embed="rId93"/>
+                          <a:blip r:embed="rId94"/>
                           <a:stretch>
                             <a:fillRect/>
                           </a:stretch>
@@ -5568,18 +5620,18 @@
                 <wp:inline>
                   <wp:extent cx="152400" cy="152400"/>
                   <wp:effectExtent b="0" l="0" r="0" t="0"/>
-                  <wp:docPr descr="" title="" id="126" name="Picture"/>
+                  <wp:docPr descr="" title="" id="127" name="Picture"/>
                   <a:graphic>
                     <a:graphicData uri="http://schemas.openxmlformats.org/drawingml/2006/picture">
                       <pic:pic>
                         <pic:nvPicPr>
-                          <pic:cNvPr descr="/Applications/quarto/share/formats/docx/note.png" id="127" name="Picture"/>
+                          <pic:cNvPr descr="/Applications/quarto/share/formats/docx/note.png" id="128" name="Picture"/>
                           <pic:cNvPicPr>
                             <a:picLocks noChangeArrowheads="1" noChangeAspect="1"/>
                           </pic:cNvPicPr>
                         </pic:nvPicPr>
                         <pic:blipFill>
-                          <a:blip r:embed="rId93"/>
+                          <a:blip r:embed="rId94"/>
                           <a:stretch>
                             <a:fillRect/>
                           </a:stretch>
@@ -5655,9 +5707,9 @@
         </w:tc>
       </w:tr>
     </w:tbl>
-    <w:bookmarkEnd w:id="128"/>
     <w:bookmarkEnd w:id="129"/>
-    <w:bookmarkStart w:id="135" w:name="X94bba58062de1951d3a507e9ea22a5fb9808d0b"/>
+    <w:bookmarkEnd w:id="130"/>
+    <w:bookmarkStart w:id="136" w:name="X94bba58062de1951d3a507e9ea22a5fb9808d0b"/>
     <w:p>
       <w:pPr>
         <w:pStyle w:val="Heading1"/>
@@ -5698,7 +5750,7 @@
         <w:t xml:space="preserve">The answer to this check should contribute to a domain-level judgement.</w:t>
       </w:r>
     </w:p>
-    <w:bookmarkStart w:id="134" w:name="examples-3"/>
+    <w:bookmarkStart w:id="135" w:name="examples-3"/>
     <w:p>
       <w:pPr>
         <w:pStyle w:val="Heading2"/>
@@ -5748,18 +5800,18 @@
                 <wp:inline>
                   <wp:extent cx="152400" cy="152400"/>
                   <wp:effectExtent b="0" l="0" r="0" t="0"/>
-                  <wp:docPr descr="" title="" id="130" name="Picture"/>
+                  <wp:docPr descr="" title="" id="131" name="Picture"/>
                   <a:graphic>
                     <a:graphicData uri="http://schemas.openxmlformats.org/drawingml/2006/picture">
                       <pic:pic>
                         <pic:nvPicPr>
-                          <pic:cNvPr descr="/Applications/quarto/share/formats/docx/note.png" id="131" name="Picture"/>
+                          <pic:cNvPr descr="/Applications/quarto/share/formats/docx/note.png" id="132" name="Picture"/>
                           <pic:cNvPicPr>
                             <a:picLocks noChangeArrowheads="1" noChangeAspect="1"/>
                           </pic:cNvPicPr>
                         </pic:nvPicPr>
                         <pic:blipFill>
-                          <a:blip r:embed="rId93"/>
+                          <a:blip r:embed="rId94"/>
                           <a:stretch>
                             <a:fillRect/>
                           </a:stretch>
@@ -5884,18 +5936,18 @@
                 <wp:inline>
                   <wp:extent cx="152400" cy="152400"/>
                   <wp:effectExtent b="0" l="0" r="0" t="0"/>
-                  <wp:docPr descr="" title="" id="132" name="Picture"/>
+                  <wp:docPr descr="" title="" id="133" name="Picture"/>
                   <a:graphic>
                     <a:graphicData uri="http://schemas.openxmlformats.org/drawingml/2006/picture">
                       <pic:pic>
                         <pic:nvPicPr>
-                          <pic:cNvPr descr="/Applications/quarto/share/formats/docx/note.png" id="133" name="Picture"/>
+                          <pic:cNvPr descr="/Applications/quarto/share/formats/docx/note.png" id="134" name="Picture"/>
                           <pic:cNvPicPr>
                             <a:picLocks noChangeArrowheads="1" noChangeAspect="1"/>
                           </pic:cNvPicPr>
                         </pic:nvPicPr>
                         <pic:blipFill>
-                          <a:blip r:embed="rId93"/>
+                          <a:blip r:embed="rId94"/>
                           <a:stretch>
                             <a:fillRect/>
                           </a:stretch>
@@ -5971,9 +6023,9 @@
         </w:tc>
       </w:tr>
     </w:tbl>
-    <w:bookmarkEnd w:id="134"/>
     <w:bookmarkEnd w:id="135"/>
-    <w:bookmarkStart w:id="139" w:name="X8121634ca53ee6fe6e673bcd39373968123162a"/>
+    <w:bookmarkEnd w:id="136"/>
+    <w:bookmarkStart w:id="140" w:name="X8121634ca53ee6fe6e673bcd39373968123162a"/>
     <w:p>
       <w:pPr>
         <w:pStyle w:val="Heading1"/>
@@ -6080,7 +6132,7 @@
         <w:t xml:space="preserve">The answer to this check should contribute to a domain-level judgement.</w:t>
       </w:r>
     </w:p>
-    <w:bookmarkStart w:id="138" w:name="example-4"/>
+    <w:bookmarkStart w:id="139" w:name="example-4"/>
     <w:p>
       <w:pPr>
         <w:pStyle w:val="Heading2"/>
@@ -6130,18 +6182,18 @@
                 <wp:inline>
                   <wp:extent cx="152400" cy="152400"/>
                   <wp:effectExtent b="0" l="0" r="0" t="0"/>
-                  <wp:docPr descr="" title="" id="136" name="Picture"/>
+                  <wp:docPr descr="" title="" id="137" name="Picture"/>
                   <a:graphic>
                     <a:graphicData uri="http://schemas.openxmlformats.org/drawingml/2006/picture">
                       <pic:pic>
                         <pic:nvPicPr>
-                          <pic:cNvPr descr="/Applications/quarto/share/formats/docx/note.png" id="137" name="Picture"/>
+                          <pic:cNvPr descr="/Applications/quarto/share/formats/docx/note.png" id="138" name="Picture"/>
                           <pic:cNvPicPr>
                             <a:picLocks noChangeArrowheads="1" noChangeAspect="1"/>
                           </pic:cNvPicPr>
                         </pic:nvPicPr>
                         <pic:blipFill>
-                          <a:blip r:embed="rId93"/>
+                          <a:blip r:embed="rId94"/>
                           <a:stretch>
                             <a:fillRect/>
                           </a:stretch>
@@ -6217,9 +6269,9 @@
         </w:tc>
       </w:tr>
     </w:tbl>
-    <w:bookmarkEnd w:id="138"/>
     <w:bookmarkEnd w:id="139"/>
-    <w:bookmarkStart w:id="143" w:name="X777b9478ff09da66e54e18f690437a9430eac35"/>
+    <w:bookmarkEnd w:id="140"/>
+    <w:bookmarkStart w:id="144" w:name="X777b9478ff09da66e54e18f690437a9430eac35"/>
     <w:p>
       <w:pPr>
         <w:pStyle w:val="Heading1"/>
@@ -6264,7 +6316,7 @@
         <w:t xml:space="preserve">The answer to this check should contribute to a domain-level judgement.</w:t>
       </w:r>
     </w:p>
-    <w:bookmarkStart w:id="142" w:name="example-5"/>
+    <w:bookmarkStart w:id="143" w:name="example-5"/>
     <w:p>
       <w:pPr>
         <w:pStyle w:val="Heading2"/>
@@ -6314,18 +6366,18 @@
                 <wp:inline>
                   <wp:extent cx="152400" cy="152400"/>
                   <wp:effectExtent b="0" l="0" r="0" t="0"/>
-                  <wp:docPr descr="" title="" id="140" name="Picture"/>
+                  <wp:docPr descr="" title="" id="141" name="Picture"/>
                   <a:graphic>
                     <a:graphicData uri="http://schemas.openxmlformats.org/drawingml/2006/picture">
                       <pic:pic>
                         <pic:nvPicPr>
-                          <pic:cNvPr descr="/Applications/quarto/share/formats/docx/note.png" id="141" name="Picture"/>
+                          <pic:cNvPr descr="/Applications/quarto/share/formats/docx/note.png" id="142" name="Picture"/>
                           <pic:cNvPicPr>
                             <a:picLocks noChangeArrowheads="1" noChangeAspect="1"/>
                           </pic:cNvPicPr>
                         </pic:nvPicPr>
                         <pic:blipFill>
-                          <a:blip r:embed="rId93"/>
+                          <a:blip r:embed="rId94"/>
                           <a:stretch>
                             <a:fillRect/>
                           </a:stretch>
@@ -6401,9 +6453,9 @@
         </w:tc>
       </w:tr>
     </w:tbl>
-    <w:bookmarkEnd w:id="142"/>
     <w:bookmarkEnd w:id="143"/>
-    <w:bookmarkStart w:id="147" w:name="X226bb196e60a36bf3967425fd08f7728284bf67"/>
+    <w:bookmarkEnd w:id="144"/>
+    <w:bookmarkStart w:id="148" w:name="X226bb196e60a36bf3967425fd08f7728284bf67"/>
     <w:p>
       <w:pPr>
         <w:pStyle w:val="Heading1"/>
@@ -6436,7 +6488,7 @@
         <w:t xml:space="preserve">The answer to this check should contribute to a domain-level judgement.</w:t>
       </w:r>
     </w:p>
-    <w:bookmarkStart w:id="146" w:name="example-6"/>
+    <w:bookmarkStart w:id="147" w:name="example-6"/>
     <w:p>
       <w:pPr>
         <w:pStyle w:val="Heading2"/>
@@ -6486,18 +6538,18 @@
                 <wp:inline>
                   <wp:extent cx="152400" cy="152400"/>
                   <wp:effectExtent b="0" l="0" r="0" t="0"/>
-                  <wp:docPr descr="" title="" id="144" name="Picture"/>
+                  <wp:docPr descr="" title="" id="145" name="Picture"/>
                   <a:graphic>
                     <a:graphicData uri="http://schemas.openxmlformats.org/drawingml/2006/picture">
                       <pic:pic>
                         <pic:nvPicPr>
-                          <pic:cNvPr descr="/Applications/quarto/share/formats/docx/note.png" id="145" name="Picture"/>
+                          <pic:cNvPr descr="/Applications/quarto/share/formats/docx/note.png" id="146" name="Picture"/>
                           <pic:cNvPicPr>
                             <a:picLocks noChangeArrowheads="1" noChangeAspect="1"/>
                           </pic:cNvPicPr>
                         </pic:nvPicPr>
                         <pic:blipFill>
-                          <a:blip r:embed="rId93"/>
+                          <a:blip r:embed="rId94"/>
                           <a:stretch>
                             <a:fillRect/>
                           </a:stretch>
@@ -6573,9 +6625,9 @@
         </w:tc>
       </w:tr>
     </w:tbl>
-    <w:bookmarkEnd w:id="146"/>
     <w:bookmarkEnd w:id="147"/>
-    <w:bookmarkStart w:id="151" w:name="X4be0e0b67fc78de22ede51835527412ee3ea986"/>
+    <w:bookmarkEnd w:id="148"/>
+    <w:bookmarkStart w:id="152" w:name="X4be0e0b67fc78de22ede51835527412ee3ea986"/>
     <w:p>
       <w:pPr>
         <w:pStyle w:val="Heading1"/>
@@ -6632,7 +6684,7 @@
         <w:t xml:space="preserve">The answer to this check should contribute to a domain-level judgement.</w:t>
       </w:r>
     </w:p>
-    <w:bookmarkStart w:id="150" w:name="example-7"/>
+    <w:bookmarkStart w:id="151" w:name="example-7"/>
     <w:p>
       <w:pPr>
         <w:pStyle w:val="Heading2"/>
@@ -6682,18 +6734,18 @@
                 <wp:inline>
                   <wp:extent cx="152400" cy="152400"/>
                   <wp:effectExtent b="0" l="0" r="0" t="0"/>
-                  <wp:docPr descr="" title="" id="148" name="Picture"/>
+                  <wp:docPr descr="" title="" id="149" name="Picture"/>
                   <a:graphic>
                     <a:graphicData uri="http://schemas.openxmlformats.org/drawingml/2006/picture">
                       <pic:pic>
                         <pic:nvPicPr>
-                          <pic:cNvPr descr="/Applications/quarto/share/formats/docx/note.png" id="149" name="Picture"/>
+                          <pic:cNvPr descr="/Applications/quarto/share/formats/docx/note.png" id="150" name="Picture"/>
                           <pic:cNvPicPr>
                             <a:picLocks noChangeArrowheads="1" noChangeAspect="1"/>
                           </pic:cNvPicPr>
                         </pic:nvPicPr>
                         <pic:blipFill>
-                          <a:blip r:embed="rId93"/>
+                          <a:blip r:embed="rId94"/>
                           <a:stretch>
                             <a:fillRect/>
                           </a:stretch>
@@ -6769,9 +6821,9 @@
         </w:tc>
       </w:tr>
     </w:tbl>
-    <w:bookmarkEnd w:id="150"/>
     <w:bookmarkEnd w:id="151"/>
-    <w:bookmarkStart w:id="155" w:name="are-any-baseline-data-implausible"/>
+    <w:bookmarkEnd w:id="152"/>
+    <w:bookmarkStart w:id="156" w:name="are-any-baseline-data-implausible"/>
     <w:p>
       <w:pPr>
         <w:pStyle w:val="Heading1"/>
@@ -6867,7 +6919,7 @@
         <w:t xml:space="preserve">The answer to this check should contribute to a domain-level judgement.</w:t>
       </w:r>
     </w:p>
-    <w:bookmarkStart w:id="154" w:name="example-8"/>
+    <w:bookmarkStart w:id="155" w:name="example-8"/>
     <w:p>
       <w:pPr>
         <w:pStyle w:val="Heading2"/>
@@ -6917,18 +6969,18 @@
                 <wp:inline>
                   <wp:extent cx="152400" cy="152400"/>
                   <wp:effectExtent b="0" l="0" r="0" t="0"/>
-                  <wp:docPr descr="" title="" id="152" name="Picture"/>
+                  <wp:docPr descr="" title="" id="153" name="Picture"/>
                   <a:graphic>
                     <a:graphicData uri="http://schemas.openxmlformats.org/drawingml/2006/picture">
                       <pic:pic>
                         <pic:nvPicPr>
-                          <pic:cNvPr descr="/Applications/quarto/share/formats/docx/note.png" id="153" name="Picture"/>
+                          <pic:cNvPr descr="/Applications/quarto/share/formats/docx/note.png" id="154" name="Picture"/>
                           <pic:cNvPicPr>
                             <a:picLocks noChangeArrowheads="1" noChangeAspect="1"/>
                           </pic:cNvPicPr>
                         </pic:nvPicPr>
                         <pic:blipFill>
-                          <a:blip r:embed="rId93"/>
+                          <a:blip r:embed="rId94"/>
                           <a:stretch>
                             <a:fillRect/>
                           </a:stretch>
@@ -7004,9 +7056,9 @@
         </w:tc>
       </w:tr>
     </w:tbl>
-    <w:bookmarkEnd w:id="154"/>
     <w:bookmarkEnd w:id="155"/>
-    <w:bookmarkStart w:id="159" w:name="X25a20c042d22525a31eac1cb852ca92a58452bc"/>
+    <w:bookmarkEnd w:id="156"/>
+    <w:bookmarkStart w:id="160" w:name="X25a20c042d22525a31eac1cb852ca92a58452bc"/>
     <w:p>
       <w:pPr>
         <w:pStyle w:val="Heading1"/>
@@ -7039,7 +7091,7 @@
         <w:t xml:space="preserve">The answer to this check should contribute to a domain-level judgement.</w:t>
       </w:r>
     </w:p>
-    <w:bookmarkStart w:id="158" w:name="example-9"/>
+    <w:bookmarkStart w:id="159" w:name="example-9"/>
     <w:p>
       <w:pPr>
         <w:pStyle w:val="Heading2"/>
@@ -7089,18 +7141,18 @@
                 <wp:inline>
                   <wp:extent cx="152400" cy="152400"/>
                   <wp:effectExtent b="0" l="0" r="0" t="0"/>
-                  <wp:docPr descr="" title="" id="156" name="Picture"/>
+                  <wp:docPr descr="" title="" id="157" name="Picture"/>
                   <a:graphic>
                     <a:graphicData uri="http://schemas.openxmlformats.org/drawingml/2006/picture">
                       <pic:pic>
                         <pic:nvPicPr>
-                          <pic:cNvPr descr="/Applications/quarto/share/formats/docx/note.png" id="157" name="Picture"/>
+                          <pic:cNvPr descr="/Applications/quarto/share/formats/docx/note.png" id="158" name="Picture"/>
                           <pic:cNvPicPr>
                             <a:picLocks noChangeArrowheads="1" noChangeAspect="1"/>
                           </pic:cNvPicPr>
                         </pic:nvPicPr>
                         <pic:blipFill>
-                          <a:blip r:embed="rId93"/>
+                          <a:blip r:embed="rId94"/>
                           <a:stretch>
                             <a:fillRect/>
                           </a:stretch>
@@ -7176,9 +7228,9 @@
         </w:tc>
       </w:tr>
     </w:tbl>
-    <w:bookmarkEnd w:id="158"/>
     <w:bookmarkEnd w:id="159"/>
-    <w:bookmarkStart w:id="163" w:name="X61041f28989a5214f0f0b0f95b600aa575f6ded"/>
+    <w:bookmarkEnd w:id="160"/>
+    <w:bookmarkStart w:id="164" w:name="X61041f28989a5214f0f0b0f95b600aa575f6ded"/>
     <w:p>
       <w:pPr>
         <w:pStyle w:val="Heading1"/>
@@ -7227,7 +7279,7 @@
         <w:t xml:space="preserve">The answer to this check should contribute to a domain-level judgement.</w:t>
       </w:r>
     </w:p>
-    <w:bookmarkStart w:id="162" w:name="example-10"/>
+    <w:bookmarkStart w:id="163" w:name="example-10"/>
     <w:p>
       <w:pPr>
         <w:pStyle w:val="Heading2"/>
@@ -7277,18 +7329,18 @@
                 <wp:inline>
                   <wp:extent cx="152400" cy="152400"/>
                   <wp:effectExtent b="0" l="0" r="0" t="0"/>
-                  <wp:docPr descr="" title="" id="160" name="Picture"/>
+                  <wp:docPr descr="" title="" id="161" name="Picture"/>
                   <a:graphic>
                     <a:graphicData uri="http://schemas.openxmlformats.org/drawingml/2006/picture">
                       <pic:pic>
                         <pic:nvPicPr>
-                          <pic:cNvPr descr="/Applications/quarto/share/formats/docx/note.png" id="161" name="Picture"/>
+                          <pic:cNvPr descr="/Applications/quarto/share/formats/docx/note.png" id="162" name="Picture"/>
                           <pic:cNvPicPr>
                             <a:picLocks noChangeArrowheads="1" noChangeAspect="1"/>
                           </pic:cNvPicPr>
                         </pic:nvPicPr>
                         <pic:blipFill>
-                          <a:blip r:embed="rId93"/>
+                          <a:blip r:embed="rId94"/>
                           <a:stretch>
                             <a:fillRect/>
                           </a:stretch>
@@ -7364,9 +7416,9 @@
         </w:tc>
       </w:tr>
     </w:tbl>
-    <w:bookmarkEnd w:id="162"/>
     <w:bookmarkEnd w:id="163"/>
-    <w:bookmarkStart w:id="169" w:name="Xe4229ef5f67d8179aec02cdd776641712e0ed09"/>
+    <w:bookmarkEnd w:id="164"/>
+    <w:bookmarkStart w:id="170" w:name="Xe4229ef5f67d8179aec02cdd776641712e0ed09"/>
     <w:p>
       <w:pPr>
         <w:pStyle w:val="Heading1"/>
@@ -7427,7 +7479,7 @@
         <w:t xml:space="preserve">The answer to this check should contribute to a domain-level judgement.</w:t>
       </w:r>
     </w:p>
-    <w:bookmarkStart w:id="168" w:name="examples-4"/>
+    <w:bookmarkStart w:id="169" w:name="examples-4"/>
     <w:p>
       <w:pPr>
         <w:pStyle w:val="Heading2"/>
@@ -7477,18 +7529,18 @@
                 <wp:inline>
                   <wp:extent cx="152400" cy="152400"/>
                   <wp:effectExtent b="0" l="0" r="0" t="0"/>
-                  <wp:docPr descr="" title="" id="164" name="Picture"/>
+                  <wp:docPr descr="" title="" id="165" name="Picture"/>
                   <a:graphic>
                     <a:graphicData uri="http://schemas.openxmlformats.org/drawingml/2006/picture">
                       <pic:pic>
                         <pic:nvPicPr>
-                          <pic:cNvPr descr="/Applications/quarto/share/formats/docx/note.png" id="165" name="Picture"/>
+                          <pic:cNvPr descr="/Applications/quarto/share/formats/docx/note.png" id="166" name="Picture"/>
                           <pic:cNvPicPr>
                             <a:picLocks noChangeArrowheads="1" noChangeAspect="1"/>
                           </pic:cNvPicPr>
                         </pic:nvPicPr>
                         <pic:blipFill>
-                          <a:blip r:embed="rId93"/>
+                          <a:blip r:embed="rId94"/>
                           <a:stretch>
                             <a:fillRect/>
                           </a:stretch>
@@ -7613,18 +7665,18 @@
                 <wp:inline>
                   <wp:extent cx="152400" cy="152400"/>
                   <wp:effectExtent b="0" l="0" r="0" t="0"/>
-                  <wp:docPr descr="" title="" id="166" name="Picture"/>
+                  <wp:docPr descr="" title="" id="167" name="Picture"/>
                   <a:graphic>
                     <a:graphicData uri="http://schemas.openxmlformats.org/drawingml/2006/picture">
                       <pic:pic>
                         <pic:nvPicPr>
-                          <pic:cNvPr descr="/Applications/quarto/share/formats/docx/note.png" id="167" name="Picture"/>
+                          <pic:cNvPr descr="/Applications/quarto/share/formats/docx/note.png" id="168" name="Picture"/>
                           <pic:cNvPicPr>
                             <a:picLocks noChangeArrowheads="1" noChangeAspect="1"/>
                           </pic:cNvPicPr>
                         </pic:nvPicPr>
                         <pic:blipFill>
-                          <a:blip r:embed="rId93"/>
+                          <a:blip r:embed="rId94"/>
                           <a:stretch>
                             <a:fillRect/>
                           </a:stretch>
@@ -7700,9 +7752,9 @@
         </w:tc>
       </w:tr>
     </w:tbl>
-    <w:bookmarkEnd w:id="168"/>
     <w:bookmarkEnd w:id="169"/>
-    <w:bookmarkStart w:id="175" w:name="Xef4b87152a03152282801c067c09980a582d182"/>
+    <w:bookmarkEnd w:id="170"/>
+    <w:bookmarkStart w:id="176" w:name="Xef4b87152a03152282801c067c09980a582d182"/>
     <w:p>
       <w:pPr>
         <w:pStyle w:val="Heading1"/>
@@ -7789,7 +7841,7 @@
         <w:t xml:space="preserve">The answer to this check should contribute to a domain-level judgement.</w:t>
       </w:r>
     </w:p>
-    <w:bookmarkStart w:id="174" w:name="examples-5"/>
+    <w:bookmarkStart w:id="175" w:name="examples-5"/>
     <w:p>
       <w:pPr>
         <w:pStyle w:val="Heading2"/>
@@ -7839,18 +7891,18 @@
                 <wp:inline>
                   <wp:extent cx="152400" cy="152400"/>
                   <wp:effectExtent b="0" l="0" r="0" t="0"/>
-                  <wp:docPr descr="" title="" id="170" name="Picture"/>
+                  <wp:docPr descr="" title="" id="171" name="Picture"/>
                   <a:graphic>
                     <a:graphicData uri="http://schemas.openxmlformats.org/drawingml/2006/picture">
                       <pic:pic>
                         <pic:nvPicPr>
-                          <pic:cNvPr descr="/Applications/quarto/share/formats/docx/note.png" id="171" name="Picture"/>
+                          <pic:cNvPr descr="/Applications/quarto/share/formats/docx/note.png" id="172" name="Picture"/>
                           <pic:cNvPicPr>
                             <a:picLocks noChangeArrowheads="1" noChangeAspect="1"/>
                           </pic:cNvPicPr>
                         </pic:nvPicPr>
                         <pic:blipFill>
-                          <a:blip r:embed="rId93"/>
+                          <a:blip r:embed="rId94"/>
                           <a:stretch>
                             <a:fillRect/>
                           </a:stretch>
@@ -7975,18 +8027,18 @@
                 <wp:inline>
                   <wp:extent cx="152400" cy="152400"/>
                   <wp:effectExtent b="0" l="0" r="0" t="0"/>
-                  <wp:docPr descr="" title="" id="172" name="Picture"/>
+                  <wp:docPr descr="" title="" id="173" name="Picture"/>
                   <a:graphic>
                     <a:graphicData uri="http://schemas.openxmlformats.org/drawingml/2006/picture">
                       <pic:pic>
                         <pic:nvPicPr>
-                          <pic:cNvPr descr="/Applications/quarto/share/formats/docx/note.png" id="173" name="Picture"/>
+                          <pic:cNvPr descr="/Applications/quarto/share/formats/docx/note.png" id="174" name="Picture"/>
                           <pic:cNvPicPr>
                             <a:picLocks noChangeArrowheads="1" noChangeAspect="1"/>
                           </pic:cNvPicPr>
                         </pic:nvPicPr>
                         <pic:blipFill>
-                          <a:blip r:embed="rId93"/>
+                          <a:blip r:embed="rId94"/>
                           <a:stretch>
                             <a:fillRect/>
                           </a:stretch>
@@ -8062,9 +8114,9 @@
         </w:tc>
       </w:tr>
     </w:tbl>
-    <w:bookmarkEnd w:id="174"/>
     <w:bookmarkEnd w:id="175"/>
-    <w:bookmarkStart w:id="182" w:name="X9a1ed448c1dc57e23cf47ea622e135bc32559f3"/>
+    <w:bookmarkEnd w:id="176"/>
+    <w:bookmarkStart w:id="183" w:name="X9a1ed448c1dc57e23cf47ea622e135bc32559f3"/>
     <w:p>
       <w:pPr>
         <w:pStyle w:val="Heading1"/>
@@ -8137,7 +8189,7 @@
         <w:t xml:space="preserve">The answer to this check should contribute to a domain-level judgement.</w:t>
       </w:r>
     </w:p>
-    <w:bookmarkStart w:id="178" w:name="example-11"/>
+    <w:bookmarkStart w:id="179" w:name="example-11"/>
     <w:p>
       <w:pPr>
         <w:pStyle w:val="Heading2"/>
@@ -8187,18 +8239,18 @@
                 <wp:inline>
                   <wp:extent cx="152400" cy="152400"/>
                   <wp:effectExtent b="0" l="0" r="0" t="0"/>
-                  <wp:docPr descr="" title="" id="176" name="Picture"/>
+                  <wp:docPr descr="" title="" id="177" name="Picture"/>
                   <a:graphic>
                     <a:graphicData uri="http://schemas.openxmlformats.org/drawingml/2006/picture">
                       <pic:pic>
                         <pic:nvPicPr>
-                          <pic:cNvPr descr="/Applications/quarto/share/formats/docx/note.png" id="177" name="Picture"/>
+                          <pic:cNvPr descr="/Applications/quarto/share/formats/docx/note.png" id="178" name="Picture"/>
                           <pic:cNvPicPr>
                             <a:picLocks noChangeArrowheads="1" noChangeAspect="1"/>
                           </pic:cNvPicPr>
                         </pic:nvPicPr>
                         <pic:blipFill>
-                          <a:blip r:embed="rId93"/>
+                          <a:blip r:embed="rId94"/>
                           <a:stretch>
                             <a:fillRect/>
                           </a:stretch>
@@ -8274,8 +8326,8 @@
         </w:tc>
       </w:tr>
     </w:tbl>
-    <w:bookmarkEnd w:id="178"/>
-    <w:bookmarkStart w:id="181" w:name="tools-for-this-check"/>
+    <w:bookmarkEnd w:id="179"/>
+    <w:bookmarkStart w:id="182" w:name="tools-for-this-check"/>
     <w:p>
       <w:pPr>
         <w:pStyle w:val="Heading2"/>
@@ -8292,7 +8344,7 @@
           <w:numId w:val="1002"/>
         </w:numPr>
       </w:pPr>
-      <w:hyperlink r:id="rId179">
+      <w:hyperlink r:id="rId180">
         <w:r>
           <w:rPr>
             <w:rStyle w:val="Hyperlink"/>
@@ -8327,7 +8379,7 @@
           <w:numId w:val="1002"/>
         </w:numPr>
       </w:pPr>
-      <w:hyperlink r:id="rId180">
+      <w:hyperlink r:id="rId181">
         <w:r>
           <w:rPr>
             <w:rStyle w:val="Hyperlink"/>
@@ -8354,9 +8406,9 @@
         <w:t xml:space="preserve">R package.</w:t>
       </w:r>
     </w:p>
-    <w:bookmarkEnd w:id="181"/>
     <w:bookmarkEnd w:id="182"/>
-    <w:bookmarkStart w:id="191" w:name="are-there-errors-in-statistical-results"/>
+    <w:bookmarkEnd w:id="183"/>
+    <w:bookmarkStart w:id="192" w:name="are-there-errors-in-statistical-results"/>
     <w:p>
       <w:pPr>
         <w:pStyle w:val="Heading1"/>
@@ -8564,7 +8616,7 @@
         <w:t xml:space="preserve">The answer to this check should contribute to a domain-level judgement.</w:t>
       </w:r>
     </w:p>
-    <w:bookmarkStart w:id="187" w:name="examples-6"/>
+    <w:bookmarkStart w:id="188" w:name="examples-6"/>
     <w:p>
       <w:pPr>
         <w:pStyle w:val="Heading2"/>
@@ -8614,18 +8666,18 @@
                 <wp:inline>
                   <wp:extent cx="152400" cy="152400"/>
                   <wp:effectExtent b="0" l="0" r="0" t="0"/>
-                  <wp:docPr descr="" title="" id="183" name="Picture"/>
+                  <wp:docPr descr="" title="" id="184" name="Picture"/>
                   <a:graphic>
                     <a:graphicData uri="http://schemas.openxmlformats.org/drawingml/2006/picture">
                       <pic:pic>
                         <pic:nvPicPr>
-                          <pic:cNvPr descr="/Applications/quarto/share/formats/docx/note.png" id="184" name="Picture"/>
+                          <pic:cNvPr descr="/Applications/quarto/share/formats/docx/note.png" id="185" name="Picture"/>
                           <pic:cNvPicPr>
                             <a:picLocks noChangeArrowheads="1" noChangeAspect="1"/>
                           </pic:cNvPicPr>
                         </pic:nvPicPr>
                         <pic:blipFill>
-                          <a:blip r:embed="rId93"/>
+                          <a:blip r:embed="rId94"/>
                           <a:stretch>
                             <a:fillRect/>
                           </a:stretch>
@@ -8750,18 +8802,18 @@
                 <wp:inline>
                   <wp:extent cx="152400" cy="152400"/>
                   <wp:effectExtent b="0" l="0" r="0" t="0"/>
-                  <wp:docPr descr="" title="" id="185" name="Picture"/>
+                  <wp:docPr descr="" title="" id="186" name="Picture"/>
                   <a:graphic>
                     <a:graphicData uri="http://schemas.openxmlformats.org/drawingml/2006/picture">
                       <pic:pic>
                         <pic:nvPicPr>
-                          <pic:cNvPr descr="/Applications/quarto/share/formats/docx/note.png" id="186" name="Picture"/>
+                          <pic:cNvPr descr="/Applications/quarto/share/formats/docx/note.png" id="187" name="Picture"/>
                           <pic:cNvPicPr>
                             <a:picLocks noChangeArrowheads="1" noChangeAspect="1"/>
                           </pic:cNvPicPr>
                         </pic:nvPicPr>
                         <pic:blipFill>
-                          <a:blip r:embed="rId93"/>
+                          <a:blip r:embed="rId94"/>
                           <a:stretch>
                             <a:fillRect/>
                           </a:stretch>
@@ -8849,8 +8901,8 @@
         </w:tc>
       </w:tr>
     </w:tbl>
-    <w:bookmarkEnd w:id="187"/>
-    <w:bookmarkStart w:id="190" w:name="tools-for-this-check-1"/>
+    <w:bookmarkEnd w:id="188"/>
+    <w:bookmarkStart w:id="191" w:name="tools-for-this-check-1"/>
     <w:p>
       <w:pPr>
         <w:pStyle w:val="Heading2"/>
@@ -8867,7 +8919,7 @@
           <w:numId w:val="1003"/>
         </w:numPr>
       </w:pPr>
-      <w:hyperlink r:id="rId188">
+      <w:hyperlink r:id="rId189">
         <w:r>
           <w:rPr>
             <w:rStyle w:val="Hyperlink"/>
@@ -8890,7 +8942,7 @@
           <w:numId w:val="1003"/>
         </w:numPr>
       </w:pPr>
-      <w:hyperlink r:id="rId189">
+      <w:hyperlink r:id="rId190">
         <w:r>
           <w:rPr>
             <w:rStyle w:val="Hyperlink"/>
@@ -8905,9 +8957,9 @@
         <w:t xml:space="preserve">— open source epidemiologic statistics</w:t>
       </w:r>
     </w:p>
-    <w:bookmarkEnd w:id="190"/>
     <w:bookmarkEnd w:id="191"/>
-    <w:bookmarkStart w:id="195" w:name="Xf08106c8b1c1dfb3fce057a2ede192fa3c7f8cf"/>
+    <w:bookmarkEnd w:id="192"/>
+    <w:bookmarkStart w:id="196" w:name="Xf08106c8b1c1dfb3fce057a2ede192fa3c7f8cf"/>
     <w:p>
       <w:pPr>
         <w:pStyle w:val="Heading1"/>
@@ -8968,7 +9020,7 @@
         <w:t xml:space="preserve">The answer to this check should contribute to a domain-level judgement.</w:t>
       </w:r>
     </w:p>
-    <w:bookmarkStart w:id="194" w:name="example-12"/>
+    <w:bookmarkStart w:id="195" w:name="example-12"/>
     <w:p>
       <w:pPr>
         <w:pStyle w:val="Heading2"/>
@@ -9018,18 +9070,18 @@
                 <wp:inline>
                   <wp:extent cx="152400" cy="152400"/>
                   <wp:effectExtent b="0" l="0" r="0" t="0"/>
-                  <wp:docPr descr="" title="" id="192" name="Picture"/>
+                  <wp:docPr descr="" title="" id="193" name="Picture"/>
                   <a:graphic>
                     <a:graphicData uri="http://schemas.openxmlformats.org/drawingml/2006/picture">
                       <pic:pic>
                         <pic:nvPicPr>
-                          <pic:cNvPr descr="/Applications/quarto/share/formats/docx/note.png" id="193" name="Picture"/>
+                          <pic:cNvPr descr="/Applications/quarto/share/formats/docx/note.png" id="194" name="Picture"/>
                           <pic:cNvPicPr>
                             <a:picLocks noChangeArrowheads="1" noChangeAspect="1"/>
                           </pic:cNvPicPr>
                         </pic:nvPicPr>
                         <pic:blipFill>
-                          <a:blip r:embed="rId93"/>
+                          <a:blip r:embed="rId94"/>
                           <a:stretch>
                             <a:fillRect/>
                           </a:stretch>
@@ -9105,9 +9157,9 @@
         </w:tc>
       </w:tr>
     </w:tbl>
-    <w:bookmarkEnd w:id="194"/>
     <w:bookmarkEnd w:id="195"/>
-    <w:bookmarkStart w:id="199" w:name="X998e9ffda712adb8047b9e55733c83474380c7f"/>
+    <w:bookmarkEnd w:id="196"/>
+    <w:bookmarkStart w:id="200" w:name="X998e9ffda712adb8047b9e55733c83474380c7f"/>
     <w:p>
       <w:pPr>
         <w:pStyle w:val="Heading1"/>
@@ -9140,7 +9192,7 @@
         <w:t xml:space="preserve">The answer to this check should contribute to a domain-level judgement.</w:t>
       </w:r>
     </w:p>
-    <w:bookmarkStart w:id="198" w:name="example-13"/>
+    <w:bookmarkStart w:id="199" w:name="example-13"/>
     <w:p>
       <w:pPr>
         <w:pStyle w:val="Heading2"/>
@@ -9190,18 +9242,18 @@
                 <wp:inline>
                   <wp:extent cx="152400" cy="152400"/>
                   <wp:effectExtent b="0" l="0" r="0" t="0"/>
-                  <wp:docPr descr="" title="" id="196" name="Picture"/>
+                  <wp:docPr descr="" title="" id="197" name="Picture"/>
                   <a:graphic>
                     <a:graphicData uri="http://schemas.openxmlformats.org/drawingml/2006/picture">
                       <pic:pic>
                         <pic:nvPicPr>
-                          <pic:cNvPr descr="/Applications/quarto/share/formats/docx/note.png" id="197" name="Picture"/>
+                          <pic:cNvPr descr="/Applications/quarto/share/formats/docx/note.png" id="198" name="Picture"/>
                           <pic:cNvPicPr>
                             <a:picLocks noChangeArrowheads="1" noChangeAspect="1"/>
                           </pic:cNvPicPr>
                         </pic:nvPicPr>
                         <pic:blipFill>
-                          <a:blip r:embed="rId93"/>
+                          <a:blip r:embed="rId94"/>
                           <a:stretch>
                             <a:fillRect/>
                           </a:stretch>
@@ -9277,9 +9329,9 @@
         </w:tc>
       </w:tr>
     </w:tbl>
-    <w:bookmarkEnd w:id="198"/>
     <w:bookmarkEnd w:id="199"/>
-    <w:bookmarkStart w:id="203" w:name="changelog"/>
+    <w:bookmarkEnd w:id="200"/>
+    <w:bookmarkStart w:id="204" w:name="changelog"/>
     <w:p>
       <w:pPr>
         <w:pStyle w:val="Heading1"/>
@@ -9296,7 +9348,7 @@
         <w:t xml:space="preserve">Changes from previous version.</w:t>
       </w:r>
     </w:p>
-    <w:bookmarkStart w:id="200" w:name="v1.1.2"/>
+    <w:bookmarkStart w:id="201" w:name="v1.1.2"/>
     <w:p>
       <w:pPr>
         <w:pStyle w:val="Heading2"/>
@@ -9317,8 +9369,8 @@
         <w:t xml:space="preserve">Edits to guidance for checks 4.8 and 4.9 to improve clarity in response to feedback.</w:t>
       </w:r>
     </w:p>
-    <w:bookmarkEnd w:id="200"/>
-    <w:bookmarkStart w:id="201" w:name="v1.1.1"/>
+    <w:bookmarkEnd w:id="201"/>
+    <w:bookmarkStart w:id="202" w:name="v1.1.1"/>
     <w:p>
       <w:pPr>
         <w:pStyle w:val="Heading2"/>
@@ -9341,7 +9393,7 @@
       <w:r>
         <w:t xml:space="preserve"> </w:t>
       </w:r>
-      <w:hyperlink r:id="rId179">
+      <w:hyperlink r:id="rId180">
         <w:r>
           <w:rPr>
             <w:rStyle w:val="Hyperlink"/>
@@ -9356,8 +9408,8 @@
         <w:t xml:space="preserve">and remove the no longer working prepubmed GRIMMER checker.</w:t>
       </w:r>
     </w:p>
-    <w:bookmarkEnd w:id="201"/>
-    <w:bookmarkStart w:id="202" w:name="v1.1"/>
+    <w:bookmarkEnd w:id="202"/>
+    <w:bookmarkStart w:id="203" w:name="v1.1"/>
     <w:p>
       <w:pPr>
         <w:pStyle w:val="Heading2"/>
@@ -9486,9 +9538,9 @@
         <w:t xml:space="preserve">Text added to check 2.2. to make it clear that lack of registration for older studies may still impact trustworthiness.</w:t>
       </w:r>
     </w:p>
-    <w:bookmarkEnd w:id="202"/>
     <w:bookmarkEnd w:id="203"/>
-    <w:bookmarkStart w:id="205" w:name="editable-template"/>
+    <w:bookmarkEnd w:id="204"/>
+    <w:bookmarkStart w:id="206" w:name="editable-template"/>
     <w:p>
       <w:pPr>
         <w:pStyle w:val="Heading1"/>
@@ -9509,7 +9561,7 @@
       <w:pPr>
         <w:pStyle w:val="BodyText"/>
       </w:pPr>
-      <w:hyperlink r:id="rId204">
+      <w:hyperlink r:id="rId205">
         <w:r>
           <w:rPr>
             <w:rStyle w:val="Hyperlink"/>
@@ -9518,8 +9570,8 @@
         </w:r>
       </w:hyperlink>
     </w:p>
-    <w:bookmarkEnd w:id="205"/>
-    <w:bookmarkStart w:id="208" w:name="license"/>
+    <w:bookmarkEnd w:id="206"/>
+    <w:bookmarkStart w:id="209" w:name="license"/>
     <w:p>
       <w:pPr>
         <w:pStyle w:val="Heading1"/>
@@ -9546,7 +9598,7 @@
       <w:r>
         <w:t xml:space="preserve"> </w:t>
       </w:r>
-      <w:hyperlink r:id="rId206">
+      <w:hyperlink r:id="rId207">
         <w:r>
           <w:rPr>
             <w:rStyle w:val="Hyperlink"/>
@@ -9571,7 +9623,7 @@
       <w:r>
         <w:t xml:space="preserve"> </w:t>
       </w:r>
-      <w:hyperlink r:id="rId207">
+      <w:hyperlink r:id="rId208">
         <w:r>
           <w:rPr>
             <w:rStyle w:val="Hyperlink"/>
@@ -9591,7 +9643,7 @@
         <w:t xml:space="preserve">You are free to copy, share, adapt, and reuse the contents of this book — text, figures, and code — for any purpose, including commercial use, provided you cite it.</w:t>
       </w:r>
     </w:p>
-    <w:bookmarkEnd w:id="208"/>
+    <w:bookmarkEnd w:id="209"/>
     <w:sectPr>
       <w:headerReference r:id="rId9" w:type="even"/>
       <w:headerReference r:id="rId11" w:type="default"/>

</xml_diff>